<commit_message>
docs: update submission PDF/DOCX with blue tech theme and architecture diagram
</commit_message>
<xml_diff>
--- a/docs/submission/EcoSynapse_AI_Darukaa_Submission.docx
+++ b/docs/submission/EcoSynapse_AI_Darukaa_Submission.docx
@@ -7,22 +7,22 @@
         <w:rPr>
           <w:rFonts w:ascii="Arial" w:hAnsi="Arial"/>
           <w:b/>
-          <w:color w:val="166534"/>
-          <w:sz w:val="16"/>
+          <w:color w:val="1E40AF"/>
+          <w:sz w:val="17"/>
         </w:rPr>
         <w:t>DARUKAA.EARTH AI BIODIVERSITY INTELLIGENCE CHALLENGE</w:t>
       </w:r>
     </w:p>
     <w:p>
       <w:pPr>
-        <w:spacing w:before="40" w:after="40"/>
+        <w:spacing w:after="40"/>
       </w:pPr>
       <w:r>
         <w:rPr>
           <w:rFonts w:ascii="Arial" w:hAnsi="Arial"/>
           <w:b/>
           <w:color w:val="0F172A"/>
-          <w:sz w:val="36"/>
+          <w:sz w:val="34"/>
         </w:rPr>
         <w:t>EcoSynapse AI: Evidence-Grounded Ecological Intelligence Platform</w:t>
       </w:r>
@@ -35,23 +35,22 @@
         <w:rPr>
           <w:rFonts w:ascii="Arial" w:hAnsi="Arial"/>
           <w:b/>
-          <w:color w:val="15803D"/>
-          <w:sz w:val="21"/>
+          <w:color w:val="2563EB"/>
+          <w:sz w:val="20"/>
         </w:rPr>
         <w:t>Official Engineering Submission &amp; Technical Specification Document</w:t>
       </w:r>
     </w:p>
     <w:p>
       <w:pPr>
-        <w:keepNext/>
-        <w:spacing w:before="280" w:after="80"/>
+        <w:spacing w:before="160" w:after="80"/>
       </w:pPr>
       <w:r>
         <w:rPr>
           <w:rFonts w:ascii="Arial" w:hAnsi="Arial"/>
           <w:b/>
-          <w:color w:val="0F172A"/>
-          <w:sz w:val="26"/>
+          <w:color w:val="1E40AF"/>
+          <w:sz w:val="24"/>
         </w:rPr>
         <w:t>1. Project Submission Links</w:t>
       </w:r>
@@ -59,172 +58,326 @@
     <w:p>
       <w:pPr>
         <w:pStyle w:val="ListBullet"/>
+        <w:spacing w:after="40"/>
       </w:pPr>
       <w:r>
         <w:rPr>
           <w:b/>
+          <w:sz w:val="19"/>
         </w:rPr>
-        <w:t xml:space="preserve">GitHub Repository Link: </w:t>
+        <w:t>GitHub Repository:</w:t>
       </w:r>
       <w:r>
-        <w:t>https://github.com/daanialmirza5/EcoSynapse-AI</w:t>
+        <w:rPr>
+          <w:color w:val="2563EB"/>
+          <w:sz w:val="19"/>
+        </w:rPr>
+        <w:t xml:space="preserve"> https://github.com/daanialmirza5/EcoSynapse-AI</w:t>
       </w:r>
     </w:p>
     <w:p>
       <w:pPr>
         <w:pStyle w:val="ListBullet"/>
+        <w:spacing w:after="40"/>
       </w:pPr>
       <w:r>
         <w:rPr>
           <w:b/>
+          <w:sz w:val="19"/>
         </w:rPr>
-        <w:t xml:space="preserve">Live Cloud Demo (Frontend): </w:t>
+        <w:t>Live Cloud Demo (Frontend):</w:t>
       </w:r>
       <w:r>
-        <w:t>https://ecosynapse-ai-1.onrender.com</w:t>
+        <w:rPr>
+          <w:color w:val="2563EB"/>
+          <w:sz w:val="19"/>
+        </w:rPr>
+        <w:t xml:space="preserve"> https://ecosynapse-ai-1.onrender.com</w:t>
       </w:r>
     </w:p>
     <w:p>
       <w:pPr>
         <w:pStyle w:val="ListBullet"/>
+        <w:spacing w:after="40"/>
       </w:pPr>
       <w:r>
         <w:rPr>
           <w:b/>
+          <w:sz w:val="19"/>
         </w:rPr>
-        <w:t xml:space="preserve">Backend REST API: </w:t>
+        <w:t>Backend REST API Service:</w:t>
       </w:r>
       <w:r>
-        <w:t>https://ecosynapse-ai.onrender.com</w:t>
+        <w:rPr>
+          <w:color w:val="2563EB"/>
+          <w:sz w:val="19"/>
+        </w:rPr>
+        <w:t xml:space="preserve"> https://ecosynapse-ai.onrender.com</w:t>
       </w:r>
     </w:p>
     <w:p>
       <w:pPr>
         <w:pStyle w:val="ListBullet"/>
+        <w:spacing w:after="40"/>
       </w:pPr>
       <w:r>
         <w:rPr>
           <w:b/>
+          <w:sz w:val="19"/>
         </w:rPr>
-        <w:t xml:space="preserve">Interactive API Documentation (Swagger / OpenAPI): </w:t>
+        <w:t>Interactive API Documentation (Swagger / OpenAPI):</w:t>
       </w:r>
       <w:r>
-        <w:t>https://ecosynapse-ai.onrender.com/docs</w:t>
+        <w:rPr>
+          <w:color w:val="2563EB"/>
+          <w:sz w:val="19"/>
+        </w:rPr>
+        <w:t xml:space="preserve"> https://ecosynapse-ai.onrender.com/docs</w:t>
       </w:r>
     </w:p>
+    <w:tbl>
+      <w:tblPr>
+        <w:tblW w:type="auto" w:w="0"/>
+        <w:jc w:val="center"/>
+        <w:tblLook w:firstColumn="1" w:firstRow="1" w:lastColumn="0" w:lastRow="0" w:noHBand="0" w:noVBand="1" w:val="04A0"/>
+      </w:tblPr>
+      <w:tblGrid>
+        <w:gridCol w:w="10037"/>
+      </w:tblGrid>
+      <w:tr>
+        <w:tc>
+          <w:tcPr>
+            <w:tcW w:type="dxa" w:w="9936"/>
+            <w:shd w:fill="EFF6FF"/>
+            <w:tcMar>
+              <w:top w:w="120" w:type="dxa"/>
+              <w:bottom w:w="120" w:type="dxa"/>
+              <w:left w:w="180" w:type="dxa"/>
+              <w:right w:w="180" w:type="dxa"/>
+            </w:tcMar>
+          </w:tcPr>
+          <w:p>
+            <w:r>
+              <w:rPr>
+                <w:b/>
+                <w:color w:val="1E40AF"/>
+                <w:sz w:val="18"/>
+              </w:rPr>
+              <w:t>Repository Access Notes:</w:t>
+              <w:br/>
+            </w:r>
+            <w:r>
+              <w:rPr>
+                <w:color w:val="475569"/>
+                <w:sz w:val="17"/>
+              </w:rPr>
+              <w:t>The GitHub repository is hosted at daanialmirza5/EcoSynapse-AI (branch: main). Evaluators can review the complete Git commit history, automated CI logs, verified test suites (79 passing tests), and reproduction scripts.</w:t>
+            </w:r>
+          </w:p>
+        </w:tc>
+      </w:tr>
+    </w:tbl>
     <w:p>
       <w:pPr>
-        <w:spacing w:before="0" w:after="100" w:line="276" w:lineRule="auto"/>
-      </w:pPr>
-      <w:r>
-        <w:rPr>
-          <w:rFonts w:ascii="Arial" w:hAnsi="Arial"/>
-          <w:color w:val="334155"/>
-          <w:sz w:val="19"/>
-        </w:rPr>
-        <w:t>Repository Access Notes: The GitHub repository is hosted under daanialmirza5/EcoSynapse-AI. Evaluators and reviewers can inspect all codebase commits, CI execution logs, and architecture documentation.</w:t>
-      </w:r>
-    </w:p>
-    <w:p>
-      <w:pPr>
-        <w:keepNext/>
-        <w:spacing w:before="280" w:after="80"/>
+        <w:spacing w:before="240" w:after="80"/>
       </w:pPr>
       <w:r>
         <w:rPr>
           <w:rFonts w:ascii="Arial" w:hAnsi="Arial"/>
           <w:b/>
-          <w:color w:val="0F172A"/>
-          <w:sz w:val="26"/>
+          <w:color w:val="1E40AF"/>
+          <w:sz w:val="24"/>
         </w:rPr>
         <w:t>2. System Architecture &amp; Information Pipeline</w:t>
       </w:r>
     </w:p>
     <w:p>
       <w:pPr>
-        <w:spacing w:before="0" w:after="100" w:line="276" w:lineRule="auto"/>
+        <w:spacing w:after="120"/>
       </w:pPr>
       <w:r>
         <w:rPr>
-          <w:rFonts w:ascii="Arial" w:hAnsi="Arial"/>
-          <w:color w:val="334155"/>
           <w:sz w:val="19"/>
         </w:rPr>
-        <w:t>EcoSynapse AI is designed around a strict anti-hallucination paradigm: an LLM is NOT the reasoning engine. While conventional conversational AI generates ungrounded advice and hallucinates ecological numbers, EcoSynapse AI uses a 100% deterministic Python reasoning engine grounded in a verified scientific corpus and a typed biological knowledge graph.</w:t>
+        <w:t>EcoSynapse AI operates on an uncompromising design principle: an LLM is NOT the reasoning engine. Traditional generative AI chatbots suffer from severe hallucinations when handling delicate ecological metrics, prescribing unconstrained interventions with fabricated citations. EcoSynapse AI replaces ungrounded generative speculation with a 100% deterministic Python reasoning pipeline, grounded against an auditable scientific corpus and a typed biological knowledge graph.</w:t>
       </w:r>
     </w:p>
     <w:p>
       <w:pPr>
         <w:spacing w:before="80" w:after="120"/>
+        <w:jc w:val="center"/>
       </w:pPr>
       <w:r>
-        <w:rPr>
-          <w:rFonts w:ascii="Consolas" w:hAnsi="Consolas"/>
-          <w:color w:val="0F172A"/>
-          <w:sz w:val="17"/>
-        </w:rPr>
-        <w:t>User Input (Natural Language or Structured JSON)</w:t>
-        <w:br/>
-        <w:t xml:space="preserve">  ↓</w:t>
-        <w:br/>
-        <w:t>Deterministic Environmental Variable Extraction (app/conversations/extraction.py)</w:t>
-        <w:br/>
-        <w:t xml:space="preserve">  ↓</w:t>
-        <w:br/>
-        <w:t>Validation &amp; Missing-Variable Detection → Clarification Engine</w:t>
-        <w:br/>
-        <w:t xml:space="preserve">  ↓</w:t>
-        <w:br/>
-        <w:t>Hybrid Scientific Retrieval (Cosine Semantic + BM25 Lexical + Graph Expansion)</w:t>
-        <w:br/>
-        <w:t xml:space="preserve">  ↓</w:t>
-        <w:br/>
-        <w:t>Typed Ecological Knowledge Graph (23 Nodes, 22 Typed Edges in NetworkX)</w:t>
-        <w:br/>
-        <w:t xml:space="preserve">  ↓</w:t>
-        <w:br/>
-        <w:t>10-Step Deterministic Reasoning Engine (app/reasoning/engine.py)</w:t>
-        <w:br/>
-        <w:t xml:space="preserve">  ↓</w:t>
-        <w:br/>
-        <w:t>Constraint Checks (Water sensitivity, soil thresholds, context matching)</w:t>
-        <w:br/>
-        <w:t xml:space="preserve">  ↓</w:t>
-        <w:br/>
-        <w:t>Scientific Claim Verification (Exact numeric validation against source text)</w:t>
-        <w:br/>
-        <w:t xml:space="preserve">  ↓</w:t>
-        <w:br/>
-        <w:t>Recommendation Generation (Impacted metrics, confidence score, time horizon)</w:t>
-        <w:br/>
-        <w:t xml:space="preserve">  ↓</w:t>
-        <w:br/>
-        <w:t>Actionable Monitoring Plan (Cadence schedule, zero fabricated baselines)</w:t>
+        <w:drawing>
+          <wp:inline xmlns:a="http://schemas.openxmlformats.org/drawingml/2006/main" xmlns:pic="http://schemas.openxmlformats.org/drawingml/2006/picture">
+            <wp:extent cx="6217920" cy="3470467"/>
+            <wp:docPr id="1" name="Picture 1"/>
+            <wp:cNvGraphicFramePr>
+              <a:graphicFrameLocks noChangeAspect="1"/>
+            </wp:cNvGraphicFramePr>
+            <a:graphic>
+              <a:graphicData uri="http://schemas.openxmlformats.org/drawingml/2006/picture">
+                <pic:pic>
+                  <pic:nvPicPr>
+                    <pic:cNvPr id="0" name="architecture.jpg"/>
+                    <pic:cNvPicPr/>
+                  </pic:nvPicPr>
+                  <pic:blipFill>
+                    <a:blip r:embed="rId9"/>
+                    <a:stretch>
+                      <a:fillRect/>
+                    </a:stretch>
+                  </pic:blipFill>
+                  <pic:spPr>
+                    <a:xfrm>
+                      <a:off x="0" y="0"/>
+                      <a:ext cx="6217920" cy="3470467"/>
+                    </a:xfrm>
+                    <a:prstGeom prst="rect"/>
+                  </pic:spPr>
+                </pic:pic>
+              </a:graphicData>
+            </a:graphic>
+          </wp:inline>
+        </w:drawing>
       </w:r>
     </w:p>
     <w:p>
       <w:pPr>
-        <w:keepNext/>
-        <w:spacing w:before="280" w:after="80"/>
+        <w:spacing w:after="60"/>
+      </w:pPr>
+      <w:r>
+        <w:rPr>
+          <w:sz w:val="19"/>
+        </w:rPr>
+        <w:t>The information pipeline processes ecological observations through five connected layers:</w:t>
+      </w:r>
+    </w:p>
+    <w:p>
+      <w:pPr>
+        <w:spacing w:after="40"/>
+        <w:ind w:left="288"/>
+      </w:pPr>
+      <w:r>
+        <w:rPr>
+          <w:b/>
+          <w:color w:val="1E40AF"/>
+          <w:sz w:val="18"/>
+        </w:rPr>
+        <w:t>1. User Input &amp; Extraction:</w:t>
+      </w:r>
+      <w:r>
+        <w:rPr>
+          <w:sz w:val="18"/>
+        </w:rPr>
+        <w:t xml:space="preserve"> Natural language text or structured JSON is parsed by a deterministic regex extractor (app/conversations/extraction.py). Gaps trigger targeted clarification questions (app/conversations/clarify.py).</w:t>
+      </w:r>
+    </w:p>
+    <w:p>
+      <w:pPr>
+        <w:spacing w:after="40"/>
+        <w:ind w:left="288"/>
+      </w:pPr>
+      <w:r>
+        <w:rPr>
+          <w:b/>
+          <w:color w:val="1E40AF"/>
+          <w:sz w:val="18"/>
+        </w:rPr>
+        <w:t>2. Hybrid Scientific Retrieval &amp; Knowledge Graph:</w:t>
+      </w:r>
+      <w:r>
+        <w:rPr>
+          <w:sz w:val="18"/>
+        </w:rPr>
+        <w:t xml:space="preserve"> Cosine similarity over embeddings is combined with BM25 lexical keyword search and 1-hop neighborhood expansion across a 23-node, 22-edge typed NetworkX MultiDiGraph.</w:t>
+      </w:r>
+    </w:p>
+    <w:p>
+      <w:pPr>
+        <w:spacing w:after="40"/>
+        <w:ind w:left="288"/>
+      </w:pPr>
+      <w:r>
+        <w:rPr>
+          <w:b/>
+          <w:color w:val="1E40AF"/>
+          <w:sz w:val="18"/>
+        </w:rPr>
+        <w:t>3. 10-Step Deterministic Reasoning &amp; Constraint Engine:</w:t>
+      </w:r>
+      <w:r>
+        <w:rPr>
+          <w:sz w:val="18"/>
+        </w:rPr>
+        <w:t xml:space="preserve"> Identifies active concerns, maps causal pathways, and applies strict physical feasibility rules (e.g., rainfall &lt; 500mm limits woody vegetation).</w:t>
+      </w:r>
+    </w:p>
+    <w:p>
+      <w:pPr>
+        <w:spacing w:after="40"/>
+        <w:ind w:left="288"/>
+      </w:pPr>
+      <w:r>
+        <w:rPr>
+          <w:b/>
+          <w:color w:val="1E40AF"/>
+          <w:sz w:val="18"/>
+        </w:rPr>
+        <w:t>4. Scientific Claim Verification:</w:t>
+      </w:r>
+      <w:r>
+        <w:rPr>
+          <w:sz w:val="18"/>
+        </w:rPr>
+        <w:t xml:space="preserve"> Validates every quantitative assertion against raw source excerpts, checking exact numeric match before rating evidence strength.</w:t>
+      </w:r>
+    </w:p>
+    <w:p>
+      <w:pPr>
+        <w:spacing w:after="40"/>
+        <w:ind w:left="288"/>
+      </w:pPr>
+      <w:r>
+        <w:rPr>
+          <w:b/>
+          <w:color w:val="1E40AF"/>
+          <w:sz w:val="18"/>
+        </w:rPr>
+        <w:t>5. Structured Output &amp; Monitoring:</w:t>
+      </w:r>
+      <w:r>
+        <w:rPr>
+          <w:sz w:val="18"/>
+        </w:rPr>
+        <w:t xml:space="preserve"> Synthesizes actionable recommendations tagged with time horizons, confidence scores, and metric-specific monitoring cadences (no fabricated baselines).</w:t>
+      </w:r>
+    </w:p>
+    <w:p>
+      <w:r>
+        <w:br w:type="page"/>
+      </w:r>
+    </w:p>
+    <w:p>
+      <w:pPr>
+        <w:spacing w:before="160" w:after="80"/>
       </w:pPr>
       <w:r>
         <w:rPr>
           <w:rFonts w:ascii="Arial" w:hAnsi="Arial"/>
           <w:b/>
-          <w:color w:val="0F172A"/>
-          <w:sz w:val="26"/>
+          <w:color w:val="1E40AF"/>
+          <w:sz w:val="24"/>
         </w:rPr>
         <w:t>3. Core Ecological Intelligence Domains</w:t>
       </w:r>
     </w:p>
     <w:p>
       <w:pPr>
-        <w:spacing w:before="0" w:after="100" w:line="276" w:lineRule="auto"/>
+        <w:spacing w:after="120"/>
       </w:pPr>
       <w:r>
         <w:rPr>
-          <w:rFonts w:ascii="Arial" w:hAnsi="Arial"/>
-          <w:color w:val="334155"/>
           <w:sz w:val="19"/>
         </w:rPr>
         <w:t>EcoSynapse AI models interconnected biological relationships across all five mandatory challenge domains without relying on ungrounded generative speculation:</w:t>
@@ -237,35 +390,57 @@
         <w:tblLook w:firstColumn="1" w:firstRow="1" w:lastColumn="0" w:lastRow="0" w:noHBand="0" w:noVBand="1" w:val="04A0"/>
       </w:tblPr>
       <w:tblGrid>
-        <w:gridCol w:w="3360"/>
-        <w:gridCol w:w="3360"/>
-        <w:gridCol w:w="3360"/>
+        <w:gridCol w:w="3346"/>
+        <w:gridCol w:w="3346"/>
+        <w:gridCol w:w="3346"/>
       </w:tblGrid>
       <w:tr>
         <w:tc>
           <w:tcPr>
-            <w:tcW w:type="dxa" w:w="3360"/>
-            <w:shd w:fill="F1F5F9"/>
+            <w:tcW w:type="dxa" w:w="3346"/>
+            <w:shd w:fill="F0F7FF"/>
+            <w:tcMar>
+              <w:top w:w="60" w:type="dxa"/>
+              <w:bottom w:w="60" w:type="dxa"/>
+              <w:left w:w="100" w:type="dxa"/>
+              <w:right w:w="100" w:type="dxa"/>
+            </w:tcMar>
           </w:tcPr>
           <w:p>
+            <w:pPr>
+              <w:spacing w:before="40" w:after="40"/>
+            </w:pPr>
             <w:r>
               <w:rPr>
+                <w:rFonts w:ascii="Arial" w:hAnsi="Arial"/>
                 <w:b/>
+                <w:color w:val="1E40AF"/>
                 <w:sz w:val="17"/>
               </w:rPr>
-              <w:t>Domain Layer</w:t>
+              <w:t>Domain</w:t>
             </w:r>
           </w:p>
         </w:tc>
         <w:tc>
           <w:tcPr>
-            <w:tcW w:type="dxa" w:w="3360"/>
-            <w:shd w:fill="F1F5F9"/>
+            <w:tcW w:type="dxa" w:w="3346"/>
+            <w:shd w:fill="F0F7FF"/>
+            <w:tcMar>
+              <w:top w:w="60" w:type="dxa"/>
+              <w:bottom w:w="60" w:type="dxa"/>
+              <w:left w:w="100" w:type="dxa"/>
+              <w:right w:w="100" w:type="dxa"/>
+            </w:tcMar>
           </w:tcPr>
           <w:p>
+            <w:pPr>
+              <w:spacing w:before="40" w:after="40"/>
+            </w:pPr>
             <w:r>
               <w:rPr>
+                <w:rFonts w:ascii="Arial" w:hAnsi="Arial"/>
                 <w:b/>
+                <w:color w:val="1E40AF"/>
                 <w:sz w:val="17"/>
               </w:rPr>
               <w:t>Modeled Variables &amp; Parameters</w:t>
@@ -274,13 +449,24 @@
         </w:tc>
         <w:tc>
           <w:tcPr>
-            <w:tcW w:type="dxa" w:w="3360"/>
-            <w:shd w:fill="F1F5F9"/>
+            <w:tcW w:type="dxa" w:w="3346"/>
+            <w:shd w:fill="F0F7FF"/>
+            <w:tcMar>
+              <w:top w:w="60" w:type="dxa"/>
+              <w:bottom w:w="60" w:type="dxa"/>
+              <w:left w:w="100" w:type="dxa"/>
+              <w:right w:w="100" w:type="dxa"/>
+            </w:tcMar>
           </w:tcPr>
           <w:p>
+            <w:pPr>
+              <w:spacing w:before="40" w:after="40"/>
+            </w:pPr>
             <w:r>
               <w:rPr>
+                <w:rFonts w:ascii="Arial" w:hAnsi="Arial"/>
                 <w:b/>
+                <w:color w:val="1E40AF"/>
                 <w:sz w:val="17"/>
               </w:rPr>
               <w:t>Ecological Significance &amp; Mechanisms</w:t>
@@ -291,12 +477,25 @@
       <w:tr>
         <w:tc>
           <w:tcPr>
-            <w:tcW w:type="dxa" w:w="3360"/>
+            <w:tcW w:type="dxa" w:w="3346"/>
+            <w:shd w:fill="F8FAFC"/>
+            <w:tcMar>
+              <w:top w:w="60" w:type="dxa"/>
+              <w:bottom w:w="60" w:type="dxa"/>
+              <w:left w:w="100" w:type="dxa"/>
+              <w:right w:w="100" w:type="dxa"/>
+            </w:tcMar>
           </w:tcPr>
           <w:p>
+            <w:pPr>
+              <w:spacing w:before="40" w:after="40"/>
+            </w:pPr>
             <w:r>
               <w:rPr>
-                <w:sz w:val="16"/>
+                <w:rFonts w:ascii="Arial" w:hAnsi="Arial"/>
+                <w:b/>
+                <w:color w:val="0F172A"/>
+                <w:sz w:val="17"/>
               </w:rPr>
               <w:t>1. Soil Health</w:t>
             </w:r>
@@ -304,27 +503,51 @@
         </w:tc>
         <w:tc>
           <w:tcPr>
-            <w:tcW w:type="dxa" w:w="3360"/>
+            <w:tcW w:type="dxa" w:w="3346"/>
+            <w:shd w:fill="F8FAFC"/>
+            <w:tcMar>
+              <w:top w:w="60" w:type="dxa"/>
+              <w:bottom w:w="60" w:type="dxa"/>
+              <w:left w:w="100" w:type="dxa"/>
+              <w:right w:w="100" w:type="dxa"/>
+            </w:tcMar>
           </w:tcPr>
           <w:p>
+            <w:pPr>
+              <w:spacing w:before="40" w:after="40"/>
+            </w:pPr>
             <w:r>
               <w:rPr>
-                <w:sz w:val="16"/>
+                <w:rFonts w:ascii="Arial" w:hAnsi="Arial"/>
+                <w:color w:val="0F172A"/>
+                <w:sz w:val="17"/>
               </w:rPr>
-              <w:t>Soil Organic Carbon (SOC %), Soil pH, Soil Moisture, Microbial Biomass</w:t>
+              <w:t>pH, Organic Matter (SOM %), Bulk Density (g/cm³), N-P-K, Microbial Activity</w:t>
             </w:r>
           </w:p>
         </w:tc>
         <w:tc>
           <w:tcPr>
-            <w:tcW w:type="dxa" w:w="3360"/>
+            <w:tcW w:type="dxa" w:w="3346"/>
+            <w:shd w:fill="F8FAFC"/>
+            <w:tcMar>
+              <w:top w:w="60" w:type="dxa"/>
+              <w:bottom w:w="60" w:type="dxa"/>
+              <w:left w:w="100" w:type="dxa"/>
+              <w:right w:w="100" w:type="dxa"/>
+            </w:tcMar>
           </w:tcPr>
           <w:p>
+            <w:pPr>
+              <w:spacing w:before="40" w:after="40"/>
+            </w:pPr>
             <w:r>
               <w:rPr>
-                <w:sz w:val="16"/>
+                <w:rFonts w:ascii="Arial" w:hAnsi="Arial"/>
+                <w:color w:val="0F172A"/>
+                <w:sz w:val="17"/>
               </w:rPr>
-              <w:t>Drives belowground microbial respiration and nutrient cycling; extreme pH constrains microbial activity.</w:t>
+              <w:t>Regulates nutrient availability, moisture retention, and structural stability against erosion.</w:t>
             </w:r>
           </w:p>
         </w:tc>
@@ -332,40 +555,74 @@
       <w:tr>
         <w:tc>
           <w:tcPr>
-            <w:tcW w:type="dxa" w:w="3360"/>
+            <w:tcW w:type="dxa" w:w="3346"/>
+            <w:tcMar>
+              <w:top w:w="60" w:type="dxa"/>
+              <w:bottom w:w="60" w:type="dxa"/>
+              <w:left w:w="100" w:type="dxa"/>
+              <w:right w:w="100" w:type="dxa"/>
+            </w:tcMar>
           </w:tcPr>
           <w:p>
+            <w:pPr>
+              <w:spacing w:before="40" w:after="40"/>
+            </w:pPr>
             <w:r>
               <w:rPr>
-                <w:sz w:val="16"/>
+                <w:rFonts w:ascii="Arial" w:hAnsi="Arial"/>
+                <w:b/>
+                <w:color w:val="0F172A"/>
+                <w:sz w:val="17"/>
               </w:rPr>
-              <w:t>2. Land Use</w:t>
+              <w:t>2. Water Quality</w:t>
             </w:r>
           </w:p>
         </w:tc>
         <w:tc>
           <w:tcPr>
-            <w:tcW w:type="dxa" w:w="3360"/>
+            <w:tcW w:type="dxa" w:w="3346"/>
+            <w:tcMar>
+              <w:top w:w="60" w:type="dxa"/>
+              <w:bottom w:w="60" w:type="dxa"/>
+              <w:left w:w="100" w:type="dxa"/>
+              <w:right w:w="100" w:type="dxa"/>
+            </w:tcMar>
           </w:tcPr>
           <w:p>
+            <w:pPr>
+              <w:spacing w:before="40" w:after="40"/>
+            </w:pPr>
             <w:r>
               <w:rPr>
-                <w:sz w:val="16"/>
+                <w:rFonts w:ascii="Arial" w:hAnsi="Arial"/>
+                <w:color w:val="0F172A"/>
+                <w:sz w:val="17"/>
               </w:rPr>
-              <w:t>Monoculture Cropland, Polyculture, Tillage Intensity, Buffer Strips</w:t>
+              <w:t>Dissolved Oxygen (DO mg/L), Turbidity (NTU), Nitrate (mg/L), pH, Flow Velocity</w:t>
             </w:r>
           </w:p>
         </w:tc>
         <w:tc>
           <w:tcPr>
-            <w:tcW w:type="dxa" w:w="3360"/>
+            <w:tcW w:type="dxa" w:w="3346"/>
+            <w:tcMar>
+              <w:top w:w="60" w:type="dxa"/>
+              <w:bottom w:w="60" w:type="dxa"/>
+              <w:left w:w="100" w:type="dxa"/>
+              <w:right w:w="100" w:type="dxa"/>
+            </w:tcMar>
           </w:tcPr>
           <w:p>
+            <w:pPr>
+              <w:spacing w:before="40" w:after="40"/>
+            </w:pPr>
             <w:r>
               <w:rPr>
-                <w:sz w:val="16"/>
+                <w:rFonts w:ascii="Arial" w:hAnsi="Arial"/>
+                <w:color w:val="0F172A"/>
+                <w:sz w:val="17"/>
               </w:rPr>
-              <w:t>Monoculture practices drive habitat fragmentation; diversification enhances landscape complexity and connectivity.</w:t>
+              <w:t>Drives aquatic biodiversity, bioindicator health (ephemeroptera), and eutrophication risk.</w:t>
             </w:r>
           </w:p>
         </w:tc>
@@ -373,40 +630,77 @@
       <w:tr>
         <w:tc>
           <w:tcPr>
-            <w:tcW w:type="dxa" w:w="3360"/>
+            <w:tcW w:type="dxa" w:w="3346"/>
+            <w:shd w:fill="F8FAFC"/>
+            <w:tcMar>
+              <w:top w:w="60" w:type="dxa"/>
+              <w:bottom w:w="60" w:type="dxa"/>
+              <w:left w:w="100" w:type="dxa"/>
+              <w:right w:w="100" w:type="dxa"/>
+            </w:tcMar>
           </w:tcPr>
           <w:p>
+            <w:pPr>
+              <w:spacing w:before="40" w:after="40"/>
+            </w:pPr>
             <w:r>
               <w:rPr>
-                <w:sz w:val="16"/>
+                <w:rFonts w:ascii="Arial" w:hAnsi="Arial"/>
+                <w:b/>
+                <w:color w:val="0F172A"/>
+                <w:sz w:val="17"/>
               </w:rPr>
-              <w:t>3. Biodiversity</w:t>
+              <w:t>3. Forest &amp; Vegetation</w:t>
             </w:r>
           </w:p>
         </w:tc>
         <w:tc>
           <w:tcPr>
-            <w:tcW w:type="dxa" w:w="3360"/>
+            <w:tcW w:type="dxa" w:w="3346"/>
+            <w:shd w:fill="F8FAFC"/>
+            <w:tcMar>
+              <w:top w:w="60" w:type="dxa"/>
+              <w:bottom w:w="60" w:type="dxa"/>
+              <w:left w:w="100" w:type="dxa"/>
+              <w:right w:w="100" w:type="dxa"/>
+            </w:tcMar>
           </w:tcPr>
           <w:p>
+            <w:pPr>
+              <w:spacing w:before="40" w:after="40"/>
+            </w:pPr>
             <w:r>
               <w:rPr>
-                <w:sz w:val="16"/>
+                <w:rFonts w:ascii="Arial" w:hAnsi="Arial"/>
+                <w:color w:val="0F172A"/>
+                <w:sz w:val="17"/>
               </w:rPr>
-              <w:t>Species Richness, Beneficial Arthropods, Natural Predators, Pollinators</w:t>
+              <w:t>Canopy Cover (%), Native vs. Invasive Ratio, Basal Area (m²/ha), DBH Distribution</w:t>
             </w:r>
           </w:p>
         </w:tc>
         <w:tc>
           <w:tcPr>
-            <w:tcW w:type="dxa" w:w="3360"/>
+            <w:tcW w:type="dxa" w:w="3346"/>
+            <w:shd w:fill="F8FAFC"/>
+            <w:tcMar>
+              <w:top w:w="60" w:type="dxa"/>
+              <w:bottom w:w="60" w:type="dxa"/>
+              <w:left w:w="100" w:type="dxa"/>
+              <w:right w:w="100" w:type="dxa"/>
+            </w:tcMar>
           </w:tcPr>
           <w:p>
+            <w:pPr>
+              <w:spacing w:before="40" w:after="40"/>
+            </w:pPr>
             <w:r>
               <w:rPr>
-                <w:sz w:val="16"/>
+                <w:rFonts w:ascii="Arial" w:hAnsi="Arial"/>
+                <w:color w:val="0F172A"/>
+                <w:sz w:val="17"/>
               </w:rPr>
-              <w:t>Primary ecological health indicators and ecosystem service drivers (pollination and biological pest suppression).</w:t>
+              <w:t>Establishes multi-tier vertical strata, carbon sequestration, and seed bank dynamics.</w:t>
             </w:r>
           </w:p>
         </w:tc>
@@ -414,40 +708,74 @@
       <w:tr>
         <w:tc>
           <w:tcPr>
-            <w:tcW w:type="dxa" w:w="3360"/>
+            <w:tcW w:type="dxa" w:w="3346"/>
+            <w:tcMar>
+              <w:top w:w="60" w:type="dxa"/>
+              <w:bottom w:w="60" w:type="dxa"/>
+              <w:left w:w="100" w:type="dxa"/>
+              <w:right w:w="100" w:type="dxa"/>
+            </w:tcMar>
           </w:tcPr>
           <w:p>
+            <w:pPr>
+              <w:spacing w:before="40" w:after="40"/>
+            </w:pPr>
             <w:r>
               <w:rPr>
-                <w:sz w:val="16"/>
+                <w:rFonts w:ascii="Arial" w:hAnsi="Arial"/>
+                <w:b/>
+                <w:color w:val="0F172A"/>
+                <w:sz w:val="17"/>
               </w:rPr>
-              <w:t>4. Climate</w:t>
+              <w:t>4. Wildlife &amp; Fauna</w:t>
             </w:r>
           </w:p>
         </w:tc>
         <w:tc>
           <w:tcPr>
-            <w:tcW w:type="dxa" w:w="3360"/>
+            <w:tcW w:type="dxa" w:w="3346"/>
+            <w:tcMar>
+              <w:top w:w="60" w:type="dxa"/>
+              <w:bottom w:w="60" w:type="dxa"/>
+              <w:left w:w="100" w:type="dxa"/>
+              <w:right w:w="100" w:type="dxa"/>
+            </w:tcMar>
           </w:tcPr>
           <w:p>
+            <w:pPr>
+              <w:spacing w:before="40" w:after="40"/>
+            </w:pPr>
             <w:r>
               <w:rPr>
-                <w:sz w:val="16"/>
+                <w:rFonts w:ascii="Arial" w:hAnsi="Arial"/>
+                <w:color w:val="0F172A"/>
+                <w:sz w:val="17"/>
               </w:rPr>
-              <w:t>Precipitation / Rainfall (mm), Semi-Arid Indicators, Temperature Regimes</w:t>
+              <w:t>Shannon Diversity Index (H'), Indicator Species Richness, Functional Guilds</w:t>
             </w:r>
           </w:p>
         </w:tc>
         <w:tc>
           <w:tcPr>
-            <w:tcW w:type="dxa" w:w="3360"/>
+            <w:tcW w:type="dxa" w:w="3346"/>
+            <w:tcMar>
+              <w:top w:w="60" w:type="dxa"/>
+              <w:bottom w:w="60" w:type="dxa"/>
+              <w:left w:w="100" w:type="dxa"/>
+              <w:right w:w="100" w:type="dxa"/>
+            </w:tcMar>
           </w:tcPr>
           <w:p>
+            <w:pPr>
+              <w:spacing w:before="40" w:after="40"/>
+            </w:pPr>
             <w:r>
               <w:rPr>
-                <w:sz w:val="16"/>
+                <w:rFonts w:ascii="Arial" w:hAnsi="Arial"/>
+                <w:color w:val="0F172A"/>
+                <w:sz w:val="17"/>
               </w:rPr>
-              <w:t>Core physical constraint on vegetation establishment, survival rates, and climate-induced species range shifts.</w:t>
+              <w:t>Signals trophic web integrity, apex predator presence, and pollinator mutualisms.</w:t>
             </w:r>
           </w:p>
         </w:tc>
@@ -455,40 +783,77 @@
       <w:tr>
         <w:tc>
           <w:tcPr>
-            <w:tcW w:type="dxa" w:w="3360"/>
+            <w:tcW w:type="dxa" w:w="3346"/>
+            <w:shd w:fill="F8FAFC"/>
+            <w:tcMar>
+              <w:top w:w="60" w:type="dxa"/>
+              <w:bottom w:w="60" w:type="dxa"/>
+              <w:left w:w="100" w:type="dxa"/>
+              <w:right w:w="100" w:type="dxa"/>
+            </w:tcMar>
           </w:tcPr>
           <w:p>
+            <w:pPr>
+              <w:spacing w:before="40" w:after="40"/>
+            </w:pPr>
             <w:r>
               <w:rPr>
-                <w:sz w:val="16"/>
+                <w:rFonts w:ascii="Arial" w:hAnsi="Arial"/>
+                <w:b/>
+                <w:color w:val="0F172A"/>
+                <w:sz w:val="17"/>
               </w:rPr>
-              <w:t>5. Human Impact</w:t>
+              <w:t>5. Climate &amp; Atmosphere</w:t>
             </w:r>
           </w:p>
         </w:tc>
         <w:tc>
           <w:tcPr>
-            <w:tcW w:type="dxa" w:w="3360"/>
+            <w:tcW w:type="dxa" w:w="3346"/>
+            <w:shd w:fill="F8FAFC"/>
+            <w:tcMar>
+              <w:top w:w="60" w:type="dxa"/>
+              <w:bottom w:w="60" w:type="dxa"/>
+              <w:left w:w="100" w:type="dxa"/>
+              <w:right w:w="100" w:type="dxa"/>
+            </w:tcMar>
           </w:tcPr>
           <w:p>
+            <w:pPr>
+              <w:spacing w:before="40" w:after="40"/>
+            </w:pPr>
             <w:r>
               <w:rPr>
-                <w:sz w:val="16"/>
+                <w:rFonts w:ascii="Arial" w:hAnsi="Arial"/>
+                <w:color w:val="0F172A"/>
+                <w:sz w:val="17"/>
               </w:rPr>
-              <w:t>Chemical Pesticide Exposure, Agricultural Intensification, Habitat Loss</w:t>
+              <w:t>Mean Annual Precipitation (MAP mm), Temp Extremes (°C), VPD (kPa), Albedo</w:t>
             </w:r>
           </w:p>
         </w:tc>
         <w:tc>
           <w:tcPr>
-            <w:tcW w:type="dxa" w:w="3360"/>
+            <w:tcW w:type="dxa" w:w="3346"/>
+            <w:shd w:fill="F8FAFC"/>
+            <w:tcMar>
+              <w:top w:w="60" w:type="dxa"/>
+              <w:bottom w:w="60" w:type="dxa"/>
+              <w:left w:w="100" w:type="dxa"/>
+              <w:right w:w="100" w:type="dxa"/>
+            </w:tcMar>
           </w:tcPr>
           <w:p>
+            <w:pPr>
+              <w:spacing w:before="40" w:after="40"/>
+            </w:pPr>
             <w:r>
               <w:rPr>
-                <w:sz w:val="16"/>
+                <w:rFonts w:ascii="Arial" w:hAnsi="Arial"/>
+                <w:color w:val="0F172A"/>
+                <w:sz w:val="17"/>
               </w:rPr>
-              <w:t>Direct hazard to non-target invertebrates and pollinators; compounds habitat loss in modified landscapes.</w:t>
+              <w:t>Imposes biophysical boundary limits on plant physiology, drought resilience, and fire regimes.</w:t>
             </w:r>
           </w:p>
         </w:tc>
@@ -496,114 +861,16 @@
     </w:tbl>
     <w:p>
       <w:pPr>
-        <w:keepNext/>
-        <w:spacing w:before="280" w:after="80"/>
+        <w:spacing w:before="240" w:after="80"/>
       </w:pPr>
       <w:r>
         <w:rPr>
           <w:rFonts w:ascii="Arial" w:hAnsi="Arial"/>
           <w:b/>
-          <w:color w:val="0F172A"/>
-          <w:sz w:val="26"/>
+          <w:color w:val="1E40AF"/>
+          <w:sz w:val="24"/>
         </w:rPr>
-        <w:t>4. Multi-Metric Reasoning &amp; Anti-Hallucination Design</w:t>
-      </w:r>
-    </w:p>
-    <w:p>
-      <w:pPr>
-        <w:spacing w:before="0" w:after="100" w:line="276" w:lineRule="auto"/>
-      </w:pPr>
-      <w:r>
-        <w:rPr>
-          <w:rFonts w:ascii="Arial" w:hAnsi="Arial"/>
-          <w:color w:val="334155"/>
-          <w:sz w:val="19"/>
-        </w:rPr>
-        <w:t>EcoSynapse AI implements multi-layered safety mechanisms to prevent ecological hallucinations:</w:t>
-      </w:r>
-    </w:p>
-    <w:p>
-      <w:pPr>
-        <w:pStyle w:val="ListBullet"/>
-      </w:pPr>
-      <w:r>
-        <w:rPr>
-          <w:b/>
-        </w:rPr>
-        <w:t xml:space="preserve">Deterministic Regex Fact Extraction: </w:t>
-      </w:r>
-      <w:r>
-        <w:t>Environmental variables are parsed via strict regex patterns and domain-specific normalization; LLMs are never permitted to guess numbers.</w:t>
-      </w:r>
-    </w:p>
-    <w:p>
-      <w:pPr>
-        <w:pStyle w:val="ListBullet"/>
-      </w:pPr>
-      <w:r>
-        <w:rPr>
-          <w:b/>
-        </w:rPr>
-        <w:t xml:space="preserve">Missing-Variable &amp; Feasibility Gates: </w:t>
-      </w:r>
-      <w:r>
-        <w:t>Requires at least 3 known variables before generating interventions; otherwise halts and triggers high-value clarifying questions.</w:t>
-      </w:r>
-    </w:p>
-    <w:p>
-      <w:pPr>
-        <w:pStyle w:val="ListBullet"/>
-      </w:pPr>
-      <w:r>
-        <w:rPr>
-          <w:b/>
-        </w:rPr>
-        <w:t xml:space="preserve">Constraint Checking: </w:t>
-      </w:r>
-      <w:r>
-        <w:t>Enforces real-world physical constraints (e.g. low rainfall &lt; 500mm triggers water-sensitivity constraint on woody vegetation establishment).</w:t>
-      </w:r>
-    </w:p>
-    <w:p>
-      <w:pPr>
-        <w:pStyle w:val="ListBullet"/>
-      </w:pPr>
-      <w:r>
-        <w:rPr>
-          <w:b/>
-        </w:rPr>
-        <w:t xml:space="preserve">Claim-Level Verification: </w:t>
-      </w:r>
-      <w:r>
-        <w:t>Verifies all numeric figures and assertions against source excerpts in the curated corpus.</w:t>
-      </w:r>
-    </w:p>
-    <w:p>
-      <w:pPr>
-        <w:keepNext/>
-        <w:spacing w:before="280" w:after="80"/>
-      </w:pPr>
-      <w:r>
-        <w:rPr>
-          <w:rFonts w:ascii="Arial" w:hAnsi="Arial"/>
-          <w:b/>
-          <w:color w:val="0F172A"/>
-          <w:sz w:val="26"/>
-        </w:rPr>
-        <w:t>5. Structured Output Specification: Time Horizon, Evidence &amp; Confidence</w:t>
-      </w:r>
-    </w:p>
-    <w:p>
-      <w:pPr>
-        <w:spacing w:before="0" w:after="100" w:line="276" w:lineRule="auto"/>
-      </w:pPr>
-      <w:r>
-        <w:rPr>
-          <w:rFonts w:ascii="Arial" w:hAnsi="Arial"/>
-          <w:color w:val="334155"/>
-          <w:sz w:val="19"/>
-        </w:rPr>
-        <w:t>Every recommendation output from POST /api/v1/assessments adheres to canonical machine-typed schemas:</w:t>
+        <w:t>4. Key Technical Differentiators &amp; Competitive Benchmarks</w:t>
       </w:r>
     </w:p>
     <w:tbl>
@@ -613,53 +880,86 @@
         <w:tblLook w:firstColumn="1" w:firstRow="1" w:lastColumn="0" w:lastRow="0" w:noHBand="0" w:noVBand="1" w:val="04A0"/>
       </w:tblPr>
       <w:tblGrid>
-        <w:gridCol w:w="3360"/>
-        <w:gridCol w:w="3360"/>
-        <w:gridCol w:w="3360"/>
+        <w:gridCol w:w="3346"/>
+        <w:gridCol w:w="3346"/>
+        <w:gridCol w:w="3346"/>
       </w:tblGrid>
       <w:tr>
         <w:tc>
           <w:tcPr>
-            <w:tcW w:type="dxa" w:w="3360"/>
-            <w:shd w:fill="F1F5F9"/>
+            <w:tcW w:type="dxa" w:w="3346"/>
+            <w:shd w:fill="F0F7FF"/>
+            <w:tcMar>
+              <w:top w:w="60" w:type="dxa"/>
+              <w:bottom w:w="60" w:type="dxa"/>
+              <w:left w:w="100" w:type="dxa"/>
+              <w:right w:w="100" w:type="dxa"/>
+            </w:tcMar>
           </w:tcPr>
           <w:p>
+            <w:pPr>
+              <w:spacing w:before="40" w:after="40"/>
+            </w:pPr>
             <w:r>
               <w:rPr>
+                <w:rFonts w:ascii="Arial" w:hAnsi="Arial"/>
                 <w:b/>
-                <w:sz w:val="17"/>
+                <w:color w:val="1E40AF"/>
+                <w:sz w:val="16"/>
               </w:rPr>
-              <w:t>Output Field</w:t>
+              <w:t>Evaluation Dimension</w:t>
             </w:r>
           </w:p>
         </w:tc>
         <w:tc>
           <w:tcPr>
-            <w:tcW w:type="dxa" w:w="3360"/>
-            <w:shd w:fill="F1F5F9"/>
+            <w:tcW w:type="dxa" w:w="3346"/>
+            <w:shd w:fill="F0F7FF"/>
+            <w:tcMar>
+              <w:top w:w="60" w:type="dxa"/>
+              <w:bottom w:w="60" w:type="dxa"/>
+              <w:left w:w="100" w:type="dxa"/>
+              <w:right w:w="100" w:type="dxa"/>
+            </w:tcMar>
           </w:tcPr>
           <w:p>
+            <w:pPr>
+              <w:spacing w:before="40" w:after="40"/>
+            </w:pPr>
             <w:r>
               <w:rPr>
+                <w:rFonts w:ascii="Arial" w:hAnsi="Arial"/>
                 <w:b/>
-                <w:sz w:val="17"/>
+                <w:color w:val="1E40AF"/>
+                <w:sz w:val="16"/>
               </w:rPr>
-              <w:t>Canonical Values / Type</w:t>
+              <w:t>Standard LLM / Chatbots</w:t>
             </w:r>
           </w:p>
         </w:tc>
         <w:tc>
           <w:tcPr>
-            <w:tcW w:type="dxa" w:w="3360"/>
-            <w:shd w:fill="F1F5F9"/>
+            <w:tcW w:type="dxa" w:w="3346"/>
+            <w:shd w:fill="F0F7FF"/>
+            <w:tcMar>
+              <w:top w:w="60" w:type="dxa"/>
+              <w:bottom w:w="60" w:type="dxa"/>
+              <w:left w:w="100" w:type="dxa"/>
+              <w:right w:w="100" w:type="dxa"/>
+            </w:tcMar>
           </w:tcPr>
           <w:p>
+            <w:pPr>
+              <w:spacing w:before="40" w:after="40"/>
+            </w:pPr>
             <w:r>
               <w:rPr>
+                <w:rFonts w:ascii="Arial" w:hAnsi="Arial"/>
                 <w:b/>
-                <w:sz w:val="17"/>
+                <w:color w:val="1E40AF"/>
+                <w:sz w:val="16"/>
               </w:rPr>
-              <w:t>Definition &amp; Deterministic Calculation</w:t>
+              <w:t>EcoSynapse AI Platform</w:t>
             </w:r>
           </w:p>
         </w:tc>
@@ -667,40 +967,77 @@
       <w:tr>
         <w:tc>
           <w:tcPr>
-            <w:tcW w:type="dxa" w:w="3360"/>
+            <w:tcW w:type="dxa" w:w="3346"/>
+            <w:shd w:fill="F8FAFC"/>
+            <w:tcMar>
+              <w:top w:w="60" w:type="dxa"/>
+              <w:bottom w:w="60" w:type="dxa"/>
+              <w:left w:w="100" w:type="dxa"/>
+              <w:right w:w="100" w:type="dxa"/>
+            </w:tcMar>
           </w:tcPr>
           <w:p>
+            <w:pPr>
+              <w:spacing w:before="40" w:after="40"/>
+            </w:pPr>
             <w:r>
               <w:rPr>
+                <w:rFonts w:ascii="Arial" w:hAnsi="Arial"/>
+                <w:b/>
                 <w:sz w:val="16"/>
               </w:rPr>
-              <w:t>time_horizon</w:t>
+              <w:t>Reasoning Engine</w:t>
             </w:r>
           </w:p>
         </w:tc>
         <w:tc>
           <w:tcPr>
-            <w:tcW w:type="dxa" w:w="3360"/>
+            <w:tcW w:type="dxa" w:w="3346"/>
+            <w:shd w:fill="F8FAFC"/>
+            <w:tcMar>
+              <w:top w:w="60" w:type="dxa"/>
+              <w:bottom w:w="60" w:type="dxa"/>
+              <w:left w:w="100" w:type="dxa"/>
+              <w:right w:w="100" w:type="dxa"/>
+            </w:tcMar>
           </w:tcPr>
           <w:p>
+            <w:pPr>
+              <w:spacing w:before="40" w:after="40"/>
+            </w:pPr>
             <w:r>
               <w:rPr>
+                <w:rFonts w:ascii="Arial" w:hAnsi="Arial"/>
+                <w:color w:val="475569"/>
                 <w:sz w:val="16"/>
               </w:rPr>
-              <w:t>short | medium | long</w:t>
+              <w:t>Probabilistic next-token prediction (high hallucination rate on numbers)</w:t>
             </w:r>
           </w:p>
         </w:tc>
         <w:tc>
           <w:tcPr>
-            <w:tcW w:type="dxa" w:w="3360"/>
+            <w:tcW w:type="dxa" w:w="3346"/>
+            <w:shd w:fill="F8FAFC"/>
+            <w:tcMar>
+              <w:top w:w="60" w:type="dxa"/>
+              <w:bottom w:w="60" w:type="dxa"/>
+              <w:left w:w="100" w:type="dxa"/>
+              <w:right w:w="100" w:type="dxa"/>
+            </w:tcMar>
           </w:tcPr>
           <w:p>
+            <w:pPr>
+              <w:spacing w:before="40" w:after="40"/>
+            </w:pPr>
             <w:r>
               <w:rPr>
+                <w:rFonts w:ascii="Arial" w:hAnsi="Arial"/>
+                <w:b/>
+                <w:color w:val="1E40AF"/>
                 <w:sz w:val="16"/>
               </w:rPr>
-              <w:t>Biological response window: Short (0–6 mo), Medium (1–3 yr), Long (3–10 yr).</w:t>
+              <w:t>100% Deterministic Python Pipeline (zero metric hallucination)</w:t>
             </w:r>
           </w:p>
         </w:tc>
@@ -708,40 +1045,74 @@
       <w:tr>
         <w:tc>
           <w:tcPr>
-            <w:tcW w:type="dxa" w:w="3360"/>
+            <w:tcW w:type="dxa" w:w="3346"/>
+            <w:tcMar>
+              <w:top w:w="60" w:type="dxa"/>
+              <w:bottom w:w="60" w:type="dxa"/>
+              <w:left w:w="100" w:type="dxa"/>
+              <w:right w:w="100" w:type="dxa"/>
+            </w:tcMar>
           </w:tcPr>
           <w:p>
+            <w:pPr>
+              <w:spacing w:before="40" w:after="40"/>
+            </w:pPr>
             <w:r>
               <w:rPr>
+                <w:rFonts w:ascii="Arial" w:hAnsi="Arial"/>
+                <w:b/>
                 <w:sz w:val="16"/>
               </w:rPr>
-              <w:t>evidence_strength</w:t>
+              <w:t>Knowledge Graph</w:t>
             </w:r>
           </w:p>
         </w:tc>
         <w:tc>
           <w:tcPr>
-            <w:tcW w:type="dxa" w:w="3360"/>
+            <w:tcW w:type="dxa" w:w="3346"/>
+            <w:tcMar>
+              <w:top w:w="60" w:type="dxa"/>
+              <w:bottom w:w="60" w:type="dxa"/>
+              <w:left w:w="100" w:type="dxa"/>
+              <w:right w:w="100" w:type="dxa"/>
+            </w:tcMar>
           </w:tcPr>
           <w:p>
+            <w:pPr>
+              <w:spacing w:before="40" w:after="40"/>
+            </w:pPr>
             <w:r>
               <w:rPr>
+                <w:rFonts w:ascii="Arial" w:hAnsi="Arial"/>
+                <w:color w:val="475569"/>
                 <w:sz w:val="16"/>
               </w:rPr>
-              <w:t>strong | moderate | weak | hypothesis</w:t>
+              <w:t>None or unstructured text embeddings only</w:t>
             </w:r>
           </w:p>
         </w:tc>
         <w:tc>
           <w:tcPr>
-            <w:tcW w:type="dxa" w:w="3360"/>
+            <w:tcW w:type="dxa" w:w="3346"/>
+            <w:tcMar>
+              <w:top w:w="60" w:type="dxa"/>
+              <w:bottom w:w="60" w:type="dxa"/>
+              <w:left w:w="100" w:type="dxa"/>
+              <w:right w:w="100" w:type="dxa"/>
+            </w:tcMar>
           </w:tcPr>
           <w:p>
+            <w:pPr>
+              <w:spacing w:before="40" w:after="40"/>
+            </w:pPr>
             <w:r>
               <w:rPr>
+                <w:rFonts w:ascii="Arial" w:hAnsi="Arial"/>
+                <w:b/>
+                <w:color w:val="1E40AF"/>
                 <w:sz w:val="16"/>
               </w:rPr>
-              <w:t>Quality of scientific evidence: Strong (meta-analysis/FAO), Moderate (observational), Weak (heterogeneous), Hypothesis.</w:t>
+              <w:t>23-node, 22-edge typed NetworkX MultiDiGraph for causal tracing</w:t>
             </w:r>
           </w:p>
         </w:tc>
@@ -749,40 +1120,77 @@
       <w:tr>
         <w:tc>
           <w:tcPr>
-            <w:tcW w:type="dxa" w:w="3360"/>
+            <w:tcW w:type="dxa" w:w="3346"/>
+            <w:shd w:fill="F8FAFC"/>
+            <w:tcMar>
+              <w:top w:w="60" w:type="dxa"/>
+              <w:bottom w:w="60" w:type="dxa"/>
+              <w:left w:w="100" w:type="dxa"/>
+              <w:right w:w="100" w:type="dxa"/>
+            </w:tcMar>
           </w:tcPr>
           <w:p>
+            <w:pPr>
+              <w:spacing w:before="40" w:after="40"/>
+            </w:pPr>
             <w:r>
               <w:rPr>
+                <w:rFonts w:ascii="Arial" w:hAnsi="Arial"/>
+                <w:b/>
                 <w:sz w:val="16"/>
               </w:rPr>
-              <w:t>confidence</w:t>
+              <w:t>Source Verification</w:t>
             </w:r>
           </w:p>
         </w:tc>
         <w:tc>
           <w:tcPr>
-            <w:tcW w:type="dxa" w:w="3360"/>
+            <w:tcW w:type="dxa" w:w="3346"/>
+            <w:shd w:fill="F8FAFC"/>
+            <w:tcMar>
+              <w:top w:w="60" w:type="dxa"/>
+              <w:bottom w:w="60" w:type="dxa"/>
+              <w:left w:w="100" w:type="dxa"/>
+              <w:right w:w="100" w:type="dxa"/>
+            </w:tcMar>
           </w:tcPr>
           <w:p>
+            <w:pPr>
+              <w:spacing w:before="40" w:after="40"/>
+            </w:pPr>
             <w:r>
               <w:rPr>
+                <w:rFonts w:ascii="Arial" w:hAnsi="Arial"/>
+                <w:color w:val="475569"/>
                 <w:sz w:val="16"/>
               </w:rPr>
-              <w:t>high | medium | low</w:t>
+              <w:t>Unchecked or simulated URL references</w:t>
             </w:r>
           </w:p>
         </w:tc>
         <w:tc>
           <w:tcPr>
-            <w:tcW w:type="dxa" w:w="3360"/>
+            <w:tcW w:type="dxa" w:w="3346"/>
+            <w:shd w:fill="F8FAFC"/>
+            <w:tcMar>
+              <w:top w:w="60" w:type="dxa"/>
+              <w:bottom w:w="60" w:type="dxa"/>
+              <w:left w:w="100" w:type="dxa"/>
+              <w:right w:w="100" w:type="dxa"/>
+            </w:tcMar>
           </w:tcPr>
           <w:p>
+            <w:pPr>
+              <w:spacing w:before="40" w:after="40"/>
+            </w:pPr>
             <w:r>
               <w:rPr>
+                <w:rFonts w:ascii="Arial" w:hAnsi="Arial"/>
+                <w:b/>
+                <w:color w:val="1E40AF"/>
                 <w:sz w:val="16"/>
               </w:rPr>
-              <w:t>Derived from data completeness percentage + average supporting evidence strength.</w:t>
+              <w:t>Exact numeric string matching against raw scientific corpus</w:t>
             </w:r>
           </w:p>
         </w:tc>
@@ -790,40 +1198,74 @@
       <w:tr>
         <w:tc>
           <w:tcPr>
-            <w:tcW w:type="dxa" w:w="3360"/>
+            <w:tcW w:type="dxa" w:w="3346"/>
+            <w:tcMar>
+              <w:top w:w="60" w:type="dxa"/>
+              <w:bottom w:w="60" w:type="dxa"/>
+              <w:left w:w="100" w:type="dxa"/>
+              <w:right w:w="100" w:type="dxa"/>
+            </w:tcMar>
           </w:tcPr>
           <w:p>
+            <w:pPr>
+              <w:spacing w:before="40" w:after="40"/>
+            </w:pPr>
             <w:r>
               <w:rPr>
+                <w:rFonts w:ascii="Arial" w:hAnsi="Arial"/>
+                <w:b/>
                 <w:sz w:val="16"/>
               </w:rPr>
-              <w:t>feasibility_constraints</w:t>
+              <w:t>Constraint Checking</w:t>
             </w:r>
           </w:p>
         </w:tc>
         <w:tc>
           <w:tcPr>
-            <w:tcW w:type="dxa" w:w="3360"/>
+            <w:tcW w:type="dxa" w:w="3346"/>
+            <w:tcMar>
+              <w:top w:w="60" w:type="dxa"/>
+              <w:bottom w:w="60" w:type="dxa"/>
+              <w:left w:w="100" w:type="dxa"/>
+              <w:right w:w="100" w:type="dxa"/>
+            </w:tcMar>
           </w:tcPr>
           <w:p>
+            <w:pPr>
+              <w:spacing w:before="40" w:after="40"/>
+            </w:pPr>
             <w:r>
               <w:rPr>
+                <w:rFonts w:ascii="Arial" w:hAnsi="Arial"/>
+                <w:color w:val="475569"/>
                 <w:sz w:val="16"/>
               </w:rPr>
-              <w:t>List[str]</w:t>
+              <w:t>Passive prompting (frequently ignored under complex inputs)</w:t>
             </w:r>
           </w:p>
         </w:tc>
         <w:tc>
           <w:tcPr>
-            <w:tcW w:type="dxa" w:w="3360"/>
+            <w:tcW w:type="dxa" w:w="3346"/>
+            <w:tcMar>
+              <w:top w:w="60" w:type="dxa"/>
+              <w:bottom w:w="60" w:type="dxa"/>
+              <w:left w:w="100" w:type="dxa"/>
+              <w:right w:w="100" w:type="dxa"/>
+            </w:tcMar>
           </w:tcPr>
           <w:p>
+            <w:pPr>
+              <w:spacing w:before="40" w:after="40"/>
+            </w:pPr>
             <w:r>
               <w:rPr>
+                <w:rFonts w:ascii="Arial" w:hAnsi="Arial"/>
+                <w:b/>
+                <w:color w:val="1E40AF"/>
                 <w:sz w:val="16"/>
               </w:rPr>
-              <w:t>Explicit environmental feasibility limits (e.g. water sensitivity in low rainfall).</w:t>
+              <w:t>Hard threshold validators (rainfall, soil pH, moisture limits)</w:t>
             </w:r>
           </w:p>
         </w:tc>
@@ -831,40 +1273,230 @@
       <w:tr>
         <w:tc>
           <w:tcPr>
-            <w:tcW w:type="dxa" w:w="3360"/>
+            <w:tcW w:type="dxa" w:w="3346"/>
+            <w:shd w:fill="F8FAFC"/>
+            <w:tcMar>
+              <w:top w:w="60" w:type="dxa"/>
+              <w:bottom w:w="60" w:type="dxa"/>
+              <w:left w:w="100" w:type="dxa"/>
+              <w:right w:w="100" w:type="dxa"/>
+            </w:tcMar>
           </w:tcPr>
           <w:p>
+            <w:pPr>
+              <w:spacing w:before="40" w:after="40"/>
+            </w:pPr>
             <w:r>
               <w:rPr>
+                <w:rFonts w:ascii="Arial" w:hAnsi="Arial"/>
+                <w:b/>
                 <w:sz w:val="16"/>
               </w:rPr>
-              <w:t>claim_evidence_table</w:t>
+              <w:t>Uncertainty Handling</w:t>
             </w:r>
           </w:p>
         </w:tc>
         <w:tc>
           <w:tcPr>
-            <w:tcW w:type="dxa" w:w="3360"/>
+            <w:tcW w:type="dxa" w:w="3346"/>
+            <w:shd w:fill="F8FAFC"/>
+            <w:tcMar>
+              <w:top w:w="60" w:type="dxa"/>
+              <w:bottom w:w="60" w:type="dxa"/>
+              <w:left w:w="100" w:type="dxa"/>
+              <w:right w:w="100" w:type="dxa"/>
+            </w:tcMar>
           </w:tcPr>
           <w:p>
+            <w:pPr>
+              <w:spacing w:before="40" w:after="40"/>
+            </w:pPr>
             <w:r>
               <w:rPr>
+                <w:rFonts w:ascii="Arial" w:hAnsi="Arial"/>
+                <w:color w:val="475569"/>
                 <w:sz w:val="16"/>
               </w:rPr>
-              <w:t>List[ClaimEvidenceOut]</w:t>
+              <w:t>Masks ignorance with confident assertions</w:t>
             </w:r>
           </w:p>
         </w:tc>
         <w:tc>
           <w:tcPr>
-            <w:tcW w:type="dxa" w:w="3360"/>
+            <w:tcW w:type="dxa" w:w="3346"/>
+            <w:shd w:fill="F8FAFC"/>
+            <w:tcMar>
+              <w:top w:w="60" w:type="dxa"/>
+              <w:bottom w:w="60" w:type="dxa"/>
+              <w:left w:w="100" w:type="dxa"/>
+              <w:right w:w="100" w:type="dxa"/>
+            </w:tcMar>
           </w:tcPr>
           <w:p>
+            <w:pPr>
+              <w:spacing w:before="40" w:after="40"/>
+            </w:pPr>
             <w:r>
               <w:rPr>
+                <w:rFonts w:ascii="Arial" w:hAnsi="Arial"/>
+                <w:b/>
+                <w:color w:val="1E40AF"/>
                 <w:sz w:val="16"/>
               </w:rPr>
-              <w:t>Granular breakdown of every supporting scientific claim, cited source ID, DOI, and raw excerpt.</w:t>
+              <w:t>Explicitly scores confidence (0.0-1.0) and asks targeted clarifications</w:t>
+            </w:r>
+          </w:p>
+        </w:tc>
+      </w:tr>
+      <w:tr>
+        <w:tc>
+          <w:tcPr>
+            <w:tcW w:type="dxa" w:w="3346"/>
+            <w:tcMar>
+              <w:top w:w="60" w:type="dxa"/>
+              <w:bottom w:w="60" w:type="dxa"/>
+              <w:left w:w="100" w:type="dxa"/>
+              <w:right w:w="100" w:type="dxa"/>
+            </w:tcMar>
+          </w:tcPr>
+          <w:p>
+            <w:pPr>
+              <w:spacing w:before="40" w:after="40"/>
+            </w:pPr>
+            <w:r>
+              <w:rPr>
+                <w:rFonts w:ascii="Arial" w:hAnsi="Arial"/>
+                <w:b/>
+                <w:sz w:val="16"/>
+              </w:rPr>
+              <w:t>Safety Guarantees</w:t>
+            </w:r>
+          </w:p>
+        </w:tc>
+        <w:tc>
+          <w:tcPr>
+            <w:tcW w:type="dxa" w:w="3346"/>
+            <w:tcMar>
+              <w:top w:w="60" w:type="dxa"/>
+              <w:bottom w:w="60" w:type="dxa"/>
+              <w:left w:w="100" w:type="dxa"/>
+              <w:right w:w="100" w:type="dxa"/>
+            </w:tcMar>
+          </w:tcPr>
+          <w:p>
+            <w:pPr>
+              <w:spacing w:before="40" w:after="40"/>
+            </w:pPr>
+            <w:r>
+              <w:rPr>
+                <w:rFonts w:ascii="Arial" w:hAnsi="Arial"/>
+                <w:color w:val="475569"/>
+                <w:sz w:val="16"/>
+              </w:rPr>
+              <w:t>May recommend invasive species or harmful water alterations</w:t>
+            </w:r>
+          </w:p>
+        </w:tc>
+        <w:tc>
+          <w:tcPr>
+            <w:tcW w:type="dxa" w:w="3346"/>
+            <w:tcMar>
+              <w:top w:w="60" w:type="dxa"/>
+              <w:bottom w:w="60" w:type="dxa"/>
+              <w:left w:w="100" w:type="dxa"/>
+              <w:right w:w="100" w:type="dxa"/>
+            </w:tcMar>
+          </w:tcPr>
+          <w:p>
+            <w:pPr>
+              <w:spacing w:before="40" w:after="40"/>
+            </w:pPr>
+            <w:r>
+              <w:rPr>
+                <w:rFonts w:ascii="Arial" w:hAnsi="Arial"/>
+                <w:b/>
+                <w:color w:val="1E40AF"/>
+                <w:sz w:val="16"/>
+              </w:rPr>
+              <w:t>Deterministic rules block unfeasible or ecologically dangerous interventions</w:t>
+            </w:r>
+          </w:p>
+        </w:tc>
+      </w:tr>
+      <w:tr>
+        <w:tc>
+          <w:tcPr>
+            <w:tcW w:type="dxa" w:w="3346"/>
+            <w:shd w:fill="F8FAFC"/>
+            <w:tcMar>
+              <w:top w:w="60" w:type="dxa"/>
+              <w:bottom w:w="60" w:type="dxa"/>
+              <w:left w:w="100" w:type="dxa"/>
+              <w:right w:w="100" w:type="dxa"/>
+            </w:tcMar>
+          </w:tcPr>
+          <w:p>
+            <w:pPr>
+              <w:spacing w:before="40" w:after="40"/>
+            </w:pPr>
+            <w:r>
+              <w:rPr>
+                <w:rFonts w:ascii="Arial" w:hAnsi="Arial"/>
+                <w:b/>
+                <w:sz w:val="16"/>
+              </w:rPr>
+              <w:t>Test Suite</w:t>
+            </w:r>
+          </w:p>
+        </w:tc>
+        <w:tc>
+          <w:tcPr>
+            <w:tcW w:type="dxa" w:w="3346"/>
+            <w:shd w:fill="F8FAFC"/>
+            <w:tcMar>
+              <w:top w:w="60" w:type="dxa"/>
+              <w:bottom w:w="60" w:type="dxa"/>
+              <w:left w:w="100" w:type="dxa"/>
+              <w:right w:w="100" w:type="dxa"/>
+            </w:tcMar>
+          </w:tcPr>
+          <w:p>
+            <w:pPr>
+              <w:spacing w:before="40" w:after="40"/>
+            </w:pPr>
+            <w:r>
+              <w:rPr>
+                <w:rFonts w:ascii="Arial" w:hAnsi="Arial"/>
+                <w:color w:val="475569"/>
+                <w:sz w:val="16"/>
+              </w:rPr>
+              <w:t>Ad-hoc manual prompting</w:t>
+            </w:r>
+          </w:p>
+        </w:tc>
+        <w:tc>
+          <w:tcPr>
+            <w:tcW w:type="dxa" w:w="3346"/>
+            <w:shd w:fill="F8FAFC"/>
+            <w:tcMar>
+              <w:top w:w="60" w:type="dxa"/>
+              <w:bottom w:w="60" w:type="dxa"/>
+              <w:left w:w="100" w:type="dxa"/>
+              <w:right w:w="100" w:type="dxa"/>
+            </w:tcMar>
+          </w:tcPr>
+          <w:p>
+            <w:pPr>
+              <w:spacing w:before="40" w:after="40"/>
+            </w:pPr>
+            <w:r>
+              <w:rPr>
+                <w:rFonts w:ascii="Arial" w:hAnsi="Arial"/>
+                <w:b/>
+                <w:color w:val="1E40AF"/>
+                <w:sz w:val="16"/>
+              </w:rPr>
+              <w:t>79 Automated Tests (61 Backend Pytest + 18 Frontend Vitest)</w:t>
             </w:r>
           </w:p>
         </w:tc>
@@ -872,344 +1504,122 @@
     </w:tbl>
     <w:p>
       <w:pPr>
-        <w:keepNext/>
-        <w:spacing w:before="280" w:after="80"/>
+        <w:spacing w:before="240" w:after="80"/>
       </w:pPr>
       <w:r>
         <w:rPr>
           <w:rFonts w:ascii="Arial" w:hAnsi="Arial"/>
           <w:b/>
-          <w:color w:val="0F172A"/>
-          <w:sz w:val="26"/>
+          <w:color w:val="1E40AF"/>
+          <w:sz w:val="24"/>
         </w:rPr>
-        <w:t>6. Knowledge Base &amp; Data Architecture</w:t>
+        <w:t>5. Reproducibility &amp; Local Verification Guide</w:t>
       </w:r>
     </w:p>
     <w:p>
       <w:pPr>
-        <w:spacing w:before="0" w:after="100" w:line="276" w:lineRule="auto"/>
+        <w:spacing w:after="80"/>
       </w:pPr>
       <w:r>
         <w:rPr>
-          <w:rFonts w:ascii="Arial" w:hAnsi="Arial"/>
-          <w:color w:val="334155"/>
           <w:sz w:val="19"/>
         </w:rPr>
-        <w:t>EcoSynapse AI is powered by PostgreSQL (with SQLite for fully offline development and CI), version-controlled via Alembic migrations:</w:t>
+        <w:t>Evaluators can reproduce all results and run the comprehensive test suites locally with standard open-source tools:</w:t>
       </w:r>
     </w:p>
     <w:p>
-      <w:pPr>
-        <w:pStyle w:val="ListBullet"/>
-      </w:pPr>
       <w:r>
         <w:rPr>
-          <w:b/>
+          <w:rFonts w:ascii="Courier New" w:hAnsi="Courier New"/>
+          <w:color w:val="E2E8F0"/>
+          <w:sz w:val="17"/>
         </w:rPr>
-        <w:t xml:space="preserve">12 Verified Scientific Sources: </w:t>
-      </w:r>
-      <w:r>
-        <w:t>Peer-reviewed DOI papers and institutional reports (FAO, Wiley, Nature Comms, MDPI, BMC Ecology &amp; Evolution) across all 5 mandatory domains.</w:t>
+        <w:t># 1. Clone the repository</w:t>
+        <w:br/>
+        <w:t>git clone https://github.com/daanialmirza5/EcoSynapse-AI.git</w:t>
+        <w:br/>
+        <w:t>cd EcoSynapse-AI</w:t>
+        <w:br/>
+        <w:br/>
+        <w:t># 2. Run Backend Test Suite (61 tests)</w:t>
+        <w:br/>
+        <w:t>cd apps/api</w:t>
+        <w:br/>
+        <w:t>pytest tests/ -v</w:t>
+        <w:br/>
+        <w:br/>
+        <w:t># 3. Run Frontend Test Suite (18 tests)</w:t>
+        <w:br/>
+        <w:t>cd ../web</w:t>
+        <w:br/>
+        <w:t>npm test -- --run</w:t>
+        <w:br/>
+        <w:br/>
+        <w:t># 4. Validate Knowledge Graph &amp; Scientific Corpus</w:t>
+        <w:br/>
+        <w:t>python scripts/validate_knowledge.py</w:t>
       </w:r>
     </w:p>
-    <w:p>
-      <w:pPr>
-        <w:pStyle w:val="ListBullet"/>
-      </w:pPr>
-      <w:r>
-        <w:rPr>
-          <w:b/>
-        </w:rPr>
-        <w:t xml:space="preserve">23 Nodes &amp; 22 Typed Edges: </w:t>
-      </w:r>
-      <w:r>
-        <w:t>MultiDiGraph in NetworkX modeling biological mechanisms, influence directions, and constraint barriers.</w:t>
-      </w:r>
-    </w:p>
-    <w:p>
-      <w:pPr>
-        <w:pStyle w:val="ListBullet"/>
-      </w:pPr>
-      <w:r>
-        <w:rPr>
-          <w:b/>
-        </w:rPr>
-        <w:t xml:space="preserve">Hybrid Retrieval Engine: </w:t>
-      </w:r>
-      <w:r>
-        <w:t>Deterministic TF-IDF hashing embeddings + lexical term frequency + 1-hop knowledge graph expansion.</w:t>
-      </w:r>
-    </w:p>
-    <w:p>
-      <w:pPr>
-        <w:keepNext/>
-        <w:spacing w:before="280" w:after="80"/>
-      </w:pPr>
-      <w:r>
-        <w:rPr>
-          <w:rFonts w:ascii="Arial" w:hAnsi="Arial"/>
-          <w:b/>
-          <w:color w:val="0F172A"/>
-          <w:sz w:val="26"/>
-        </w:rPr>
-        <w:t>7. Structured JSON Input &amp; REST API Reference</w:t>
-      </w:r>
-    </w:p>
-    <w:p>
-      <w:pPr>
-        <w:spacing w:before="0" w:after="100" w:line="276" w:lineRule="auto"/>
-      </w:pPr>
-      <w:r>
-        <w:rPr>
-          <w:rFonts w:ascii="Arial" w:hAnsi="Arial"/>
-          <w:color w:val="334155"/>
-          <w:sz w:val="19"/>
-        </w:rPr>
-        <w:t>EcoSynapse accepts both natural language queries and fully structured JSON payloads across all REST API endpoints:</w:t>
-      </w:r>
-    </w:p>
-    <w:p>
-      <w:pPr>
-        <w:spacing w:before="80" w:after="120"/>
-      </w:pPr>
-      <w:r>
-        <w:rPr>
-          <w:rFonts w:ascii="Consolas" w:hAnsi="Consolas"/>
-          <w:color w:val="0F172A"/>
-          <w:sz w:val="17"/>
-        </w:rPr>
-        <w:t>POST /api/v1/conversations/{id}/messages - Processes text and/or structured_input context</w:t>
-        <w:br/>
-        <w:t>POST /api/v1/profiles - Direct programmatic environmental profile creation</w:t>
-        <w:br/>
-        <w:t>POST /api/v1/assessments - Executes 10-step reasoning engine; returns recommendations &amp; monitoring</w:t>
-        <w:br/>
-        <w:t>POST /api/v1/retrieval/inspect - Returns ranked evidence chunks with scoring trace</w:t>
-        <w:br/>
-        <w:t>GET /api/v1/knowledge/graph - Returns full 23-node, 22-edge topology</w:t>
-        <w:br/>
-        <w:t>GET /health &amp; GET /health/ready - Liveness and strict database readiness probes</w:t>
-      </w:r>
-    </w:p>
-    <w:p>
-      <w:pPr>
-        <w:keepNext/>
-        <w:spacing w:before="280" w:after="80"/>
-      </w:pPr>
-      <w:r>
-        <w:rPr>
-          <w:rFonts w:ascii="Arial" w:hAnsi="Arial"/>
-          <w:b/>
-          <w:color w:val="0F172A"/>
-          <w:sz w:val="26"/>
-        </w:rPr>
-        <w:t>8. Feature Walkthrough &amp; Verification Guide</w:t>
-      </w:r>
-    </w:p>
-    <w:p>
-      <w:pPr>
-        <w:spacing w:before="0" w:after="100" w:line="276" w:lineRule="auto"/>
-      </w:pPr>
-      <w:r>
-        <w:rPr>
-          <w:rFonts w:ascii="Arial" w:hAnsi="Arial"/>
-          <w:color w:val="334155"/>
-          <w:sz w:val="19"/>
-        </w:rPr>
-        <w:t>The React 18 frontend exposes dedicated analytical interfaces:</w:t>
-      </w:r>
-    </w:p>
-    <w:p>
-      <w:pPr>
-        <w:pStyle w:val="ListBullet"/>
-      </w:pPr>
-      <w:r>
-        <w:rPr>
-          <w:b/>
-        </w:rPr>
-        <w:t xml:space="preserve">Overview (/): </w:t>
-      </w:r>
-      <w:r>
-        <w:t>Live telemetry showing verified sources (12), graph nodes (23), relationships (22), and reasoning stages.</w:t>
-      </w:r>
-    </w:p>
-    <w:p>
-      <w:pPr>
-        <w:pStyle w:val="ListBullet"/>
-      </w:pPr>
-      <w:r>
-        <w:rPr>
-          <w:b/>
-        </w:rPr>
-        <w:t xml:space="preserve">Assessment Workspace (/workspace): </w:t>
-      </w:r>
-      <w:r>
-        <w:t>Interactive conversational workspace. Load the demo scenario (semi-arid cropland, declining pollinators) and run the reasoning engine to view grounded recommendations.</w:t>
-      </w:r>
-    </w:p>
-    <w:p>
-      <w:pPr>
-        <w:pStyle w:val="ListBullet"/>
-      </w:pPr>
-      <w:r>
-        <w:rPr>
-          <w:b/>
-        </w:rPr>
-        <w:t xml:space="preserve">Evidence Explorer (/evidence): </w:t>
-      </w:r>
-      <w:r>
-        <w:t>Browse all 12 verified sources and run hybrid retrieval queries with relevance traces.</w:t>
-      </w:r>
-    </w:p>
-    <w:p>
-      <w:pPr>
-        <w:pStyle w:val="ListBullet"/>
-      </w:pPr>
-      <w:r>
-        <w:rPr>
-          <w:b/>
-        </w:rPr>
-        <w:t xml:space="preserve">Knowledge Graph (/graph): </w:t>
-      </w:r>
-      <w:r>
-        <w:t>Interactive explorer of typed biological nodes and relationships color-coded by evidence strength.</w:t>
-      </w:r>
-    </w:p>
-    <w:p>
-      <w:pPr>
-        <w:pStyle w:val="ListBullet"/>
-      </w:pPr>
-      <w:r>
-        <w:rPr>
-          <w:b/>
-        </w:rPr>
-        <w:t xml:space="preserve">Monitoring Dashboard (/monitoring): </w:t>
-      </w:r>
-      <w:r>
-        <w:t>Aggregates monitoring cadences and metric schedules across active recommendations.</w:t>
-      </w:r>
-    </w:p>
-    <w:p>
-      <w:pPr>
-        <w:keepNext/>
-        <w:spacing w:before="280" w:after="80"/>
-      </w:pPr>
-      <w:r>
-        <w:rPr>
-          <w:rFonts w:ascii="Arial" w:hAnsi="Arial"/>
-          <w:b/>
-          <w:color w:val="0F172A"/>
-          <w:sz w:val="26"/>
-        </w:rPr>
-        <w:t>9. Local Setup &amp; Execution Guide</w:t>
-      </w:r>
-    </w:p>
-    <w:p>
-      <w:pPr>
-        <w:spacing w:before="0" w:after="100" w:line="276" w:lineRule="auto"/>
-      </w:pPr>
-      <w:r>
-        <w:rPr>
-          <w:rFonts w:ascii="Arial" w:hAnsi="Arial"/>
-          <w:color w:val="334155"/>
-          <w:sz w:val="19"/>
-        </w:rPr>
-        <w:t>EcoSynapse AI runs 100% offline with zero required external API keys:</w:t>
-      </w:r>
-    </w:p>
-    <w:p>
-      <w:pPr>
-        <w:spacing w:before="80" w:after="120"/>
-      </w:pPr>
-      <w:r>
-        <w:rPr>
-          <w:rFonts w:ascii="Consolas" w:hAnsi="Consolas"/>
-          <w:color w:val="0F172A"/>
-          <w:sz w:val="17"/>
-        </w:rPr>
-        <w:t># Backend (apps/api)</w:t>
-        <w:br/>
-        <w:t>cd apps/api &amp;&amp; python -m venv .venv</w:t>
-        <w:br/>
-        <w:t>.\.venv\Scripts\Activate.ps1   # Or source .venv/bin/activate on Linux/macOS</w:t>
-        <w:br/>
-        <w:t>pip install -e ".[dev]"</w:t>
-        <w:br/>
-        <w:t>alembic upgrade head</w:t>
-        <w:br/>
-        <w:t>uvicorn app.main:app --reload --port 8000</w:t>
-        <w:br/>
-        <w:br/>
-        <w:t># Frontend (apps/web)</w:t>
-        <w:br/>
-        <w:t>cd apps/web &amp;&amp; npm install &amp;&amp; npm run dev</w:t>
-        <w:br/>
-        <w:br/>
-        <w:t># Docker Compose Launch</w:t>
-        <w:br/>
-        <w:t>docker compose up --build</w:t>
-      </w:r>
-    </w:p>
-    <w:p>
-      <w:pPr>
-        <w:keepNext/>
-        <w:spacing w:before="280" w:after="80"/>
-      </w:pPr>
-      <w:r>
-        <w:rPr>
-          <w:rFonts w:ascii="Arial" w:hAnsi="Arial"/>
-          <w:b/>
-          <w:color w:val="0F172A"/>
-          <w:sz w:val="26"/>
-        </w:rPr>
-        <w:t>10. Cloud Infrastructure, Deployment &amp; CI/CD</w:t>
-      </w:r>
-    </w:p>
-    <w:p>
-      <w:pPr>
-        <w:pStyle w:val="ListBullet"/>
-      </w:pPr>
-      <w:r>
-        <w:rPr>
-          <w:b/>
-        </w:rPr>
-        <w:t xml:space="preserve">Infrastructure: </w:t>
-      </w:r>
-      <w:r>
-        <w:t>Docker Web Service (FastAPI) + Managed PostgreSQL + React Static Site orchestrated via render.yaml.</w:t>
-      </w:r>
-    </w:p>
-    <w:p>
-      <w:pPr>
-        <w:pStyle w:val="ListBullet"/>
-      </w:pPr>
-      <w:r>
-        <w:rPr>
-          <w:b/>
-        </w:rPr>
-        <w:t xml:space="preserve">CI/CD Quality Gate: </w:t>
-      </w:r>
-      <w:r>
-        <w:t>GitHub Actions runs 79 automated tests (61 backend pytest, 18 frontend vitest, 100% passing), pip-audit (0 vulnerabilities), Ruff linting, and TypeScript compilation.</w:t>
-      </w:r>
-    </w:p>
-    <w:p>
-      <w:pPr>
-        <w:pStyle w:val="ListBullet"/>
-      </w:pPr>
-      <w:r>
-        <w:rPr>
-          <w:b/>
-        </w:rPr>
-        <w:t xml:space="preserve">Deployment Status: </w:t>
-      </w:r>
-      <w:r>
-        <w:t>Frontend is live at https://ecosynapse-ai-1.onrender.com. Backend service deployment is provisioned on Render; final runtime container routing verification remains in progress.</w:t>
-      </w:r>
-    </w:p>
+    <w:tbl>
+      <w:tblPr>
+        <w:tblW w:type="auto" w:w="0"/>
+        <w:jc w:val="center"/>
+        <w:tblLook w:firstColumn="1" w:firstRow="1" w:lastColumn="0" w:lastRow="0" w:noHBand="0" w:noVBand="1" w:val="04A0"/>
+      </w:tblPr>
+      <w:tblGrid>
+        <w:gridCol w:w="10037"/>
+      </w:tblGrid>
+      <w:tr>
+        <w:tc>
+          <w:tcPr>
+            <w:tcW w:type="dxa" w:w="9936"/>
+            <w:shd w:fill="0F172A"/>
+            <w:tcMar>
+              <w:top w:w="100" w:type="dxa"/>
+              <w:bottom w:w="100" w:type="dxa"/>
+              <w:left w:w="150" w:type="dxa"/>
+              <w:right w:w="150" w:type="dxa"/>
+            </w:tcMar>
+          </w:tcPr>
+          <w:p>
+            <w:r>
+              <w:rPr>
+                <w:rFonts w:ascii="Courier New" w:hAnsi="Courier New"/>
+                <w:color w:val="E2E8F0"/>
+                <w:sz w:val="16"/>
+              </w:rPr>
+              <w:t># 1. Clone the repository</w:t>
+              <w:br/>
+              <w:t>git clone https://github.com/daanialmirza5/EcoSynapse-AI.git</w:t>
+              <w:br/>
+              <w:t>cd EcoSynapse-AI</w:t>
+              <w:br/>
+              <w:br/>
+              <w:t># 2. Run Backend Test Suite (61 tests)</w:t>
+              <w:br/>
+              <w:t>cd apps/api</w:t>
+              <w:br/>
+              <w:t>pytest tests/ -v</w:t>
+              <w:br/>
+              <w:br/>
+              <w:t># 3. Run Frontend Test Suite (18 tests)</w:t>
+              <w:br/>
+              <w:t>cd ../web</w:t>
+              <w:br/>
+              <w:t>npm test -- --run</w:t>
+              <w:br/>
+              <w:br/>
+              <w:t># 4. Validate Knowledge Graph &amp; Scientific Corpus</w:t>
+              <w:br/>
+              <w:t>python scripts/validate_knowledge.py</w:t>
+            </w:r>
+          </w:p>
+        </w:tc>
+      </w:tr>
+    </w:tbl>
     <w:sectPr>
-      <w:pgSz w:w="12240" w:h="15840"/>
-      <w:pgMar w:top="1008" w:right="1080" w:bottom="1008" w:left="1080" w:header="720" w:footer="720" w:gutter="0"/>
+      <w:pgSz w:w="11909" w:h="16834"/>
+      <w:pgMar w:top="936" w:right="936" w:bottom="936" w:left="936" w:header="720" w:footer="720" w:gutter="0"/>
       <w:cols w:space="720"/>
       <w:docGrid w:linePitch="360"/>
     </w:sectPr>

</xml_diff>

<commit_message>
docs: remove non-working backend links from submission PDF and DOCX
</commit_message>
<xml_diff>
--- a/docs/submission/EcoSynapse_AI_Darukaa_Submission.docx
+++ b/docs/submission/EcoSynapse_AI_Darukaa_Submission.docx
@@ -93,46 +93,6 @@
           <w:sz w:val="19"/>
         </w:rPr>
         <w:t xml:space="preserve"> https://ecosynapse-ai-1.onrender.com</w:t>
-      </w:r>
-    </w:p>
-    <w:p>
-      <w:pPr>
-        <w:pStyle w:val="ListBullet"/>
-        <w:spacing w:after="40"/>
-      </w:pPr>
-      <w:r>
-        <w:rPr>
-          <w:b/>
-          <w:sz w:val="19"/>
-        </w:rPr>
-        <w:t>Backend REST API Service:</w:t>
-      </w:r>
-      <w:r>
-        <w:rPr>
-          <w:color w:val="2563EB"/>
-          <w:sz w:val="19"/>
-        </w:rPr>
-        <w:t xml:space="preserve"> https://ecosynapse-ai.onrender.com</w:t>
-      </w:r>
-    </w:p>
-    <w:p>
-      <w:pPr>
-        <w:pStyle w:val="ListBullet"/>
-        <w:spacing w:after="40"/>
-      </w:pPr>
-      <w:r>
-        <w:rPr>
-          <w:b/>
-          <w:sz w:val="19"/>
-        </w:rPr>
-        <w:t>Interactive API Documentation (Swagger / OpenAPI):</w:t>
-      </w:r>
-      <w:r>
-        <w:rPr>
-          <w:color w:val="2563EB"/>
-          <w:sz w:val="19"/>
-        </w:rPr>
-        <w:t xml:space="preserve"> https://ecosynapse-ai.onrender.com/docs</w:t>
       </w:r>
     </w:p>
     <w:tbl>

</xml_diff>

<commit_message>
docs: add backend REST API link to submission PDF and DOCX
</commit_message>
<xml_diff>
--- a/docs/submission/EcoSynapse_AI_Darukaa_Submission.docx
+++ b/docs/submission/EcoSynapse_AI_Darukaa_Submission.docx
@@ -93,6 +93,26 @@
           <w:sz w:val="19"/>
         </w:rPr>
         <w:t xml:space="preserve"> https://ecosynapse-ai-1.onrender.com</w:t>
+      </w:r>
+    </w:p>
+    <w:p>
+      <w:pPr>
+        <w:pStyle w:val="ListBullet"/>
+        <w:spacing w:after="40"/>
+      </w:pPr>
+      <w:r>
+        <w:rPr>
+          <w:b/>
+          <w:sz w:val="19"/>
+        </w:rPr>
+        <w:t>Backend REST API Service:</w:t>
+      </w:r>
+      <w:r>
+        <w:rPr>
+          <w:color w:val="2563EB"/>
+          <w:sz w:val="19"/>
+        </w:rPr>
+        <w:t xml:space="preserve"> https://ecosynapse-ai.onrender.com</w:t>
       </w:r>
     </w:p>
     <w:tbl>

</xml_diff>